<commit_message>
Add positioning against LLM Economist to introduction
Co-Authored-By: Claude Sonnet 5.5 <noreply@anthropic.com>
Claude-Session: https://claude.ai/code/session_01Hv17up5m6zhCqJ5SAWN1gB
</commit_message>
<xml_diff>
--- a/isr_draft/ISR_reframed_abstract_and_theory.docx
+++ b/isr_draft/ISR_reframed_abstract_and_theory.docx
@@ -187,6 +187,22 @@
         <w:pStyle w:val="BodyText"/>
       </w:pPr>
       <w:r>
+        <w:t xml:space="preserve">Our work is closest to a small but growing body of LLM-based agent simulations of economic and political life. The LLM Economist framework (Karten et al. 2025), for instance, places LLM worker agents under a planner agent and shows that periodic persona-level voting can improve welfare under decentralized governance. Its objective, however, is policy design: the question is whether a governance procedure converges toward a socially desirable outcome. Ours is the complementary question of whether, and under what rules, governance positions become captured. In that setting the planner is a mechanism-design device with a well-defined objective, whereas in ours office is held by agents with private interests, and the object of study is how those agents use it.</w:t>
+      </w:r>
+    </w:p>
+    <w:p>
+      <w:pPr>
+        <w:pStyle w:val="BodyText"/>
+      </w:pPr>
+      <w:r>
+        <w:t xml:space="preserve">Two further differences set our design apart. First, prior simulations tend to run over short horizons and to examine aggregate outcomes (Zhang and Shang 2026; see also recent critiques of the short horizons and thin aggregate measurement in generative-agent economies). We instead study persistence directly, using spell lengths, exclusion duration, and the half-life of control, which short runs cannot reveal. Second, existing work treats the voting rule as a given feature of the environment. We treat it, together with allocation authority and accountability records, as a manipulated design variable, which is what allows us to attribute differences in entrenchment to governance and not to the particular scenario.</w:t>
+      </w:r>
+    </w:p>
+    <w:p>
+      <w:pPr>
+        <w:pStyle w:val="BodyText"/>
+      </w:pPr>
+      <w:r>
         <w:t xml:space="preserve">We make three contributions. First, we introduce</w:t>
       </w:r>
       <w:r>
@@ -952,6 +968,32 @@
       </w:r>
       <w:r>
         <w:t xml:space="preserve">. Boston: Harvard Business School Press.</w:t>
+      </w:r>
+    </w:p>
+    <w:p>
+      <w:pPr>
+        <w:pStyle w:val="BodyText"/>
+      </w:pPr>
+      <w:r>
+        <w:t xml:space="preserve">Karten, S., Li, W., Ding, Z., Kleiner, S., Bai, Y., and Jin, C. 2025.</w:t>
+      </w:r>
+      <w:r>
+        <w:t xml:space="preserve"> </w:t>
+      </w:r>
+      <w:r>
+        <w:t xml:space="preserve">“</w:t>
+      </w:r>
+      <w:r>
+        <w:t xml:space="preserve">LLM Economist: Large Population Models and Mechanism Design in Multi-Agent Generative Simulacra,</w:t>
+      </w:r>
+      <w:r>
+        <w:t xml:space="preserve">”</w:t>
+      </w:r>
+      <w:r>
+        <w:t xml:space="preserve"> </w:t>
+      </w:r>
+      <w:r>
+        <w:t xml:space="preserve">arXiv:2507.15815.</w:t>
       </w:r>
     </w:p>
     <w:p>

</xml_diff>